<commit_message>
Create vote model, update models
</commit_message>
<xml_diff>
--- a/documents/AI Crypto Advisor Server Description.docx
+++ b/documents/AI Crypto Advisor Server Description.docx
@@ -86,37 +86,70 @@
           <w:bCs/>
           <w:sz w:val="24"/>
           <w:szCs w:val="24"/>
-          <w:u w:val="single"/>
-        </w:rPr>
-      </w:pPr>
-      <w:proofErr w:type="spellStart"/>
-      <w:r>
-        <w:rPr>
-          <w:b/>
-          <w:bCs/>
-          <w:sz w:val="24"/>
-          <w:szCs w:val="24"/>
-        </w:rPr>
-        <w:t>userId</w:t>
-      </w:r>
-      <w:proofErr w:type="spellEnd"/>
-      <w:r>
-        <w:rPr>
-          <w:b/>
-          <w:bCs/>
-          <w:sz w:val="24"/>
-          <w:szCs w:val="24"/>
-        </w:rPr>
-        <w:t>, Email, name</w:t>
-      </w:r>
-      <w:r>
-        <w:rPr>
-          <w:b/>
-          <w:bCs/>
-          <w:sz w:val="24"/>
-          <w:szCs w:val="24"/>
-        </w:rPr>
-        <w:t>, password</w:t>
+        </w:rPr>
+      </w:pPr>
+      <w:r>
+        <w:rPr>
+          <w:b/>
+          <w:bCs/>
+          <w:sz w:val="24"/>
+          <w:szCs w:val="24"/>
+        </w:rPr>
+        <w:t>Name, e</w:t>
+      </w:r>
+      <w:r>
+        <w:rPr>
+          <w:b/>
+          <w:bCs/>
+          <w:sz w:val="24"/>
+          <w:szCs w:val="24"/>
+        </w:rPr>
+        <w:t>mail</w:t>
+      </w:r>
+      <w:r>
+        <w:rPr>
+          <w:b/>
+          <w:bCs/>
+          <w:sz w:val="24"/>
+          <w:szCs w:val="24"/>
+        </w:rPr>
+        <w:t xml:space="preserve">, </w:t>
+      </w:r>
+      <w:r>
+        <w:rPr>
+          <w:b/>
+          <w:bCs/>
+          <w:sz w:val="24"/>
+          <w:szCs w:val="24"/>
+        </w:rPr>
+        <w:t>password</w:t>
+      </w:r>
+      <w:r>
+        <w:rPr>
+          <w:b/>
+          <w:bCs/>
+          <w:sz w:val="24"/>
+          <w:szCs w:val="24"/>
+        </w:rPr>
+        <w:t xml:space="preserve">, </w:t>
+      </w:r>
+      <w:r>
+        <w:rPr>
+          <w:b/>
+          <w:bCs/>
+          <w:sz w:val="24"/>
+          <w:szCs w:val="24"/>
+        </w:rPr>
+        <w:t>preference</w:t>
+      </w:r>
+      <w:r>
+        <w:rPr>
+          <w:b/>
+          <w:bCs/>
+          <w:sz w:val="24"/>
+          <w:szCs w:val="24"/>
+        </w:rPr>
+        <w:t>, votes</w:t>
       </w:r>
     </w:p>
     <w:p>
@@ -230,7 +263,58 @@
         <w:t>contentTypes</w:t>
       </w:r>
       <w:proofErr w:type="spellEnd"/>
-      <w:r>
+    </w:p>
+    <w:p>
+      <w:pPr>
+        <w:pStyle w:val="3"/>
+        <w:bidi w:val="0"/>
+        <w:rPr>
+          <w:rFonts w:asciiTheme="minorHAnsi" w:eastAsiaTheme="minorHAnsi" w:hAnsiTheme="minorHAnsi" w:cstheme="minorBidi"/>
+          <w:b/>
+          <w:bCs/>
+          <w:color w:val="auto"/>
+        </w:rPr>
+      </w:pPr>
+      <w:r>
+        <w:t>Vote</w:t>
+      </w:r>
+      <w:r>
+        <w:t>:</w:t>
+      </w:r>
+    </w:p>
+    <w:p>
+      <w:pPr>
+        <w:pStyle w:val="3"/>
+        <w:numPr>
+          <w:ilvl w:val="0"/>
+          <w:numId w:val="3"/>
+        </w:numPr>
+        <w:bidi w:val="0"/>
+        <w:rPr>
+          <w:rFonts w:asciiTheme="minorHAnsi" w:eastAsiaTheme="minorHAnsi" w:hAnsiTheme="minorHAnsi" w:cstheme="minorBidi"/>
+          <w:b/>
+          <w:bCs/>
+          <w:color w:val="auto"/>
+        </w:rPr>
+      </w:pPr>
+      <w:r>
+        <w:rPr>
+          <w:rFonts w:asciiTheme="minorHAnsi" w:eastAsiaTheme="minorHAnsi" w:hAnsiTheme="minorHAnsi" w:cstheme="minorBidi"/>
+          <w:b/>
+          <w:bCs/>
+          <w:color w:val="auto"/>
+        </w:rPr>
+        <w:t>Data saved:</w:t>
+      </w:r>
+    </w:p>
+    <w:p>
+      <w:pPr>
+        <w:pStyle w:val="a3"/>
+        <w:numPr>
+          <w:ilvl w:val="1"/>
+          <w:numId w:val="3"/>
+        </w:numPr>
+        <w:bidi w:val="0"/>
         <w:rPr>
           <w:b/>
           <w:bCs/>
@@ -238,8 +322,45 @@
           <w:szCs w:val="24"/>
           <w:u w:val="single"/>
         </w:rPr>
+      </w:pPr>
+      <w:proofErr w:type="spellStart"/>
+      <w:r>
+        <w:rPr>
+          <w:b/>
+          <w:bCs/>
+          <w:sz w:val="24"/>
+          <w:szCs w:val="24"/>
+        </w:rPr>
+        <w:t>userId</w:t>
+      </w:r>
+      <w:proofErr w:type="spellEnd"/>
+      <w:r>
+        <w:rPr>
+          <w:b/>
+          <w:bCs/>
+          <w:sz w:val="24"/>
+          <w:szCs w:val="24"/>
+        </w:rPr>
         <w:t xml:space="preserve">, </w:t>
       </w:r>
+      <w:r>
+        <w:rPr>
+          <w:b/>
+          <w:bCs/>
+          <w:sz w:val="24"/>
+          <w:szCs w:val="24"/>
+        </w:rPr>
+        <w:t>type</w:t>
+      </w:r>
+      <w:r>
+        <w:rPr>
+          <w:b/>
+          <w:bCs/>
+          <w:sz w:val="24"/>
+          <w:szCs w:val="24"/>
+        </w:rPr>
+        <w:t xml:space="preserve">, </w:t>
+      </w:r>
       <w:proofErr w:type="spellStart"/>
       <w:r>
         <w:rPr>
@@ -248,7 +369,7 @@
           <w:sz w:val="24"/>
           <w:szCs w:val="24"/>
         </w:rPr>
-        <w:t>createdAt</w:t>
+        <w:t>itemTitle</w:t>
       </w:r>
       <w:proofErr w:type="spellEnd"/>
       <w:r>
@@ -257,21 +378,18 @@
           <w:bCs/>
           <w:sz w:val="24"/>
           <w:szCs w:val="24"/>
-          <w:u w:val="single"/>
         </w:rPr>
         <w:t xml:space="preserve">, </w:t>
       </w:r>
-      <w:proofErr w:type="spellStart"/>
-      <w:r>
-        <w:rPr>
-          <w:b/>
-          <w:bCs/>
-          <w:sz w:val="24"/>
-          <w:szCs w:val="24"/>
-        </w:rPr>
-        <w:t>updatedAt</w:t>
-      </w:r>
-      <w:proofErr w:type="spellEnd"/>
+      <w:r>
+        <w:rPr>
+          <w:b/>
+          <w:bCs/>
+          <w:sz w:val="24"/>
+          <w:szCs w:val="24"/>
+        </w:rPr>
+        <w:t>value</w:t>
+      </w:r>
     </w:p>
     <w:p>
       <w:pPr>
@@ -522,6 +640,67 @@
     </w:p>
     <w:p>
       <w:pPr>
+        <w:pStyle w:val="a3"/>
+        <w:numPr>
+          <w:ilvl w:val="1"/>
+          <w:numId w:val="1"/>
+        </w:numPr>
+        <w:bidi w:val="0"/>
+        <w:rPr>
+          <w:b/>
+          <w:bCs/>
+          <w:sz w:val="24"/>
+          <w:szCs w:val="24"/>
+        </w:rPr>
+      </w:pPr>
+      <w:r>
+        <w:rPr>
+          <w:b/>
+          <w:bCs/>
+          <w:sz w:val="24"/>
+          <w:szCs w:val="24"/>
+        </w:rPr>
+        <w:t>Vote content</w:t>
+      </w:r>
+      <w:r>
+        <w:rPr>
+          <w:b/>
+          <w:bCs/>
+          <w:sz w:val="24"/>
+          <w:szCs w:val="24"/>
+        </w:rPr>
+        <w:t xml:space="preserve"> </w:t>
+      </w:r>
+      <w:r>
+        <w:rPr>
+          <w:b/>
+          <w:bCs/>
+          <w:sz w:val="24"/>
+          <w:szCs w:val="24"/>
+        </w:rPr>
+        <w:t>(</w:t>
+      </w:r>
+      <w:r>
+        <w:rPr>
+          <w:b/>
+          <w:bCs/>
+          <w:sz w:val="24"/>
+          <w:szCs w:val="24"/>
+        </w:rPr>
+        <w:t>'Market News', 'Charts', 'Social', 'Fun'</w:t>
+      </w:r>
+      <w:r>
+        <w:rPr>
+          <w:b/>
+          <w:bCs/>
+          <w:sz w:val="24"/>
+          <w:szCs w:val="24"/>
+        </w:rPr>
+        <w:t>)</w:t>
+      </w:r>
+    </w:p>
+    <w:p>
+      <w:pPr>
         <w:bidi w:val="0"/>
         <w:rPr>
           <w:b/>
@@ -563,19 +742,8 @@
           <w:sz w:val="24"/>
           <w:szCs w:val="24"/>
         </w:rPr>
-        <w:t>/</w:t>
-      </w:r>
-      <w:proofErr w:type="gramStart"/>
-      <w:r>
-        <w:rPr>
-          <w:b/>
-          <w:bCs/>
-          <w:sz w:val="24"/>
-          <w:szCs w:val="24"/>
-        </w:rPr>
-        <w:t>user</w:t>
-      </w:r>
-      <w:proofErr w:type="gramEnd"/>
+        <w:t>/user</w:t>
+      </w:r>
     </w:p>
     <w:p>
       <w:pPr>
@@ -660,19 +828,8 @@
           <w:sz w:val="24"/>
           <w:szCs w:val="24"/>
         </w:rPr>
-        <w:t>/</w:t>
-      </w:r>
-      <w:proofErr w:type="gramStart"/>
-      <w:r>
-        <w:rPr>
-          <w:b/>
-          <w:bCs/>
-          <w:sz w:val="24"/>
-          <w:szCs w:val="24"/>
-        </w:rPr>
-        <w:t>register</w:t>
-      </w:r>
-      <w:proofErr w:type="gramEnd"/>
+        <w:t>/register</w:t>
+      </w:r>
     </w:p>
     <w:p>
       <w:pPr>
@@ -732,16 +889,63 @@
           <w:sz w:val="24"/>
           <w:szCs w:val="24"/>
         </w:rPr>
-        <w:t xml:space="preserve"> email,</w:t>
-      </w:r>
-      <w:r>
-        <w:rPr>
-          <w:b/>
-          <w:bCs/>
-          <w:sz w:val="24"/>
-          <w:szCs w:val="24"/>
-        </w:rPr>
-        <w:t xml:space="preserve"> name, password</w:t>
+        <w:t xml:space="preserve"> </w:t>
+      </w:r>
+      <w:proofErr w:type="gramStart"/>
+      <w:r>
+        <w:rPr>
+          <w:b/>
+          <w:bCs/>
+          <w:sz w:val="24"/>
+          <w:szCs w:val="24"/>
+        </w:rPr>
+        <w:t>name</w:t>
+      </w:r>
+      <w:r>
+        <w:rPr>
+          <w:b/>
+          <w:bCs/>
+          <w:sz w:val="24"/>
+          <w:szCs w:val="24"/>
+        </w:rPr>
+        <w:t xml:space="preserve"> </w:t>
+      </w:r>
+      <w:r>
+        <w:rPr>
+          <w:b/>
+          <w:bCs/>
+          <w:sz w:val="24"/>
+          <w:szCs w:val="24"/>
+        </w:rPr>
+        <w:t>,</w:t>
+      </w:r>
+      <w:proofErr w:type="gramEnd"/>
+      <w:r>
+        <w:rPr>
+          <w:b/>
+          <w:bCs/>
+          <w:sz w:val="24"/>
+          <w:szCs w:val="24"/>
+        </w:rPr>
+        <w:t xml:space="preserve"> </w:t>
+      </w:r>
+      <w:r>
+        <w:rPr>
+          <w:b/>
+          <w:bCs/>
+          <w:sz w:val="24"/>
+          <w:szCs w:val="24"/>
+        </w:rPr>
+        <w:t>email</w:t>
+      </w:r>
+      <w:r>
+        <w:rPr>
+          <w:b/>
+          <w:bCs/>
+          <w:sz w:val="24"/>
+          <w:szCs w:val="24"/>
+        </w:rPr>
+        <w:t>, password</w:t>
       </w:r>
     </w:p>
     <w:p>
@@ -888,19 +1092,8 @@
           <w:sz w:val="24"/>
           <w:szCs w:val="24"/>
         </w:rPr>
-        <w:t xml:space="preserve">Body: </w:t>
-      </w:r>
-      <w:proofErr w:type="gramStart"/>
-      <w:r>
-        <w:rPr>
-          <w:b/>
-          <w:bCs/>
-          <w:sz w:val="24"/>
-          <w:szCs w:val="24"/>
-        </w:rPr>
-        <w:t>email ,</w:t>
-      </w:r>
-      <w:proofErr w:type="gramEnd"/>
+        <w:t>Body:</w:t>
+      </w:r>
       <w:r>
         <w:rPr>
           <w:b/>
@@ -917,7 +1110,16 @@
           <w:sz w:val="24"/>
           <w:szCs w:val="24"/>
         </w:rPr>
-        <w:t>name, password</w:t>
+        <w:t>email,</w:t>
+      </w:r>
+      <w:r>
+        <w:rPr>
+          <w:b/>
+          <w:bCs/>
+          <w:sz w:val="24"/>
+          <w:szCs w:val="24"/>
+        </w:rPr>
+        <w:t xml:space="preserve"> password</w:t>
       </w:r>
     </w:p>
     <w:p>
@@ -976,19 +1178,8 @@
           <w:sz w:val="24"/>
           <w:szCs w:val="24"/>
         </w:rPr>
-        <w:t>/</w:t>
-      </w:r>
-      <w:proofErr w:type="gramStart"/>
-      <w:r>
-        <w:rPr>
-          <w:b/>
-          <w:bCs/>
-          <w:sz w:val="24"/>
-          <w:szCs w:val="24"/>
-        </w:rPr>
-        <w:t>preferences</w:t>
-      </w:r>
-      <w:proofErr w:type="gramEnd"/>
+        <w:t>/preferences</w:t>
+      </w:r>
       <w:r>
         <w:rPr>
           <w:b/>
@@ -1028,6 +1219,7 @@
         <w:rPr>
           <w:b/>
           <w:bCs/>
+          <w:color w:val="7030A0"/>
           <w:sz w:val="24"/>
           <w:szCs w:val="24"/>
         </w:rPr>
@@ -1095,7 +1287,6 @@
         </w:rPr>
         <w:t xml:space="preserve">assets, </w:t>
       </w:r>
-      <w:proofErr w:type="spellStart"/>
       <w:proofErr w:type="gramStart"/>
       <w:r>
         <w:rPr>
@@ -1104,17 +1295,7 @@
           <w:sz w:val="24"/>
           <w:szCs w:val="24"/>
         </w:rPr>
-        <w:t>investorType</w:t>
-      </w:r>
-      <w:proofErr w:type="spellEnd"/>
-      <w:r>
-        <w:rPr>
-          <w:b/>
-          <w:bCs/>
-          <w:sz w:val="24"/>
-          <w:szCs w:val="24"/>
-        </w:rPr>
-        <w:t xml:space="preserve"> ,</w:t>
+        <w:t>investorType ,</w:t>
       </w:r>
       <w:proofErr w:type="gramEnd"/>
       <w:r>
@@ -1124,19 +1305,8 @@
           <w:sz w:val="24"/>
           <w:szCs w:val="24"/>
         </w:rPr>
-        <w:t xml:space="preserve"> </w:t>
-      </w:r>
-      <w:proofErr w:type="spellStart"/>
-      <w:r>
-        <w:rPr>
-          <w:b/>
-          <w:bCs/>
-          <w:sz w:val="24"/>
-          <w:szCs w:val="24"/>
-        </w:rPr>
-        <w:t>contentTypes</w:t>
-      </w:r>
-      <w:proofErr w:type="spellEnd"/>
+        <w:t xml:space="preserve"> contentTypes</w:t>
+      </w:r>
     </w:p>
     <w:p>
       <w:pPr>
@@ -1174,6 +1344,7 @@
         <w:rPr>
           <w:b/>
           <w:bCs/>
+          <w:color w:val="0070C0"/>
           <w:sz w:val="24"/>
           <w:szCs w:val="24"/>
         </w:rPr>
@@ -1217,6 +1388,316 @@
     <w:p>
       <w:pPr>
         <w:pStyle w:val="a3"/>
+        <w:numPr>
+          <w:ilvl w:val="1"/>
+          <w:numId w:val="2"/>
+        </w:numPr>
+        <w:bidi w:val="0"/>
+        <w:rPr>
+          <w:b/>
+          <w:bCs/>
+          <w:sz w:val="24"/>
+          <w:szCs w:val="24"/>
+        </w:rPr>
+      </w:pPr>
+      <w:r>
+        <w:rPr>
+          <w:b/>
+          <w:bCs/>
+          <w:sz w:val="24"/>
+          <w:szCs w:val="24"/>
+        </w:rPr>
+        <w:lastRenderedPageBreak/>
+        <w:t>/</w:t>
+      </w:r>
+      <w:proofErr w:type="gramStart"/>
+      <w:r>
+        <w:rPr>
+          <w:b/>
+          <w:bCs/>
+          <w:sz w:val="24"/>
+          <w:szCs w:val="24"/>
+        </w:rPr>
+        <w:t>votes</w:t>
+      </w:r>
+      <w:proofErr w:type="gramEnd"/>
+      <w:r>
+        <w:rPr>
+          <w:b/>
+          <w:bCs/>
+          <w:sz w:val="24"/>
+          <w:szCs w:val="24"/>
+        </w:rPr>
+        <w:t xml:space="preserve"> (</w:t>
+      </w:r>
+      <w:r>
+        <w:rPr>
+          <w:b/>
+          <w:bCs/>
+          <w:sz w:val="24"/>
+          <w:szCs w:val="24"/>
+        </w:rPr>
+        <w:t>Login first</w:t>
+      </w:r>
+      <w:r>
+        <w:rPr>
+          <w:b/>
+          <w:bCs/>
+          <w:sz w:val="24"/>
+          <w:szCs w:val="24"/>
+        </w:rPr>
+        <w:t>)</w:t>
+      </w:r>
+    </w:p>
+    <w:p>
+      <w:pPr>
+        <w:pStyle w:val="a3"/>
+        <w:numPr>
+          <w:ilvl w:val="2"/>
+          <w:numId w:val="2"/>
+        </w:numPr>
+        <w:bidi w:val="0"/>
+        <w:rPr>
+          <w:b/>
+          <w:bCs/>
+          <w:color w:val="7030A0"/>
+          <w:sz w:val="24"/>
+          <w:szCs w:val="24"/>
+        </w:rPr>
+      </w:pPr>
+      <w:r>
+        <w:rPr>
+          <w:b/>
+          <w:bCs/>
+          <w:color w:val="7030A0"/>
+          <w:sz w:val="24"/>
+          <w:szCs w:val="24"/>
+        </w:rPr>
+        <w:t>POST</w:t>
+      </w:r>
+    </w:p>
+    <w:p>
+      <w:pPr>
+        <w:pStyle w:val="a3"/>
+        <w:numPr>
+          <w:ilvl w:val="2"/>
+          <w:numId w:val="2"/>
+        </w:numPr>
+        <w:bidi w:val="0"/>
+        <w:rPr>
+          <w:b/>
+          <w:bCs/>
+          <w:sz w:val="24"/>
+          <w:szCs w:val="24"/>
+          <w:rtl/>
+        </w:rPr>
+      </w:pPr>
+      <w:r>
+        <w:rPr>
+          <w:b/>
+          <w:bCs/>
+          <w:sz w:val="24"/>
+          <w:szCs w:val="24"/>
+        </w:rPr>
+        <w:t xml:space="preserve">Body: </w:t>
+      </w:r>
+      <w:proofErr w:type="gramStart"/>
+      <w:r>
+        <w:rPr>
+          <w:b/>
+          <w:bCs/>
+          <w:sz w:val="24"/>
+          <w:szCs w:val="24"/>
+        </w:rPr>
+        <w:t>type</w:t>
+      </w:r>
+      <w:proofErr w:type="gramEnd"/>
+      <w:r>
+        <w:rPr>
+          <w:b/>
+          <w:bCs/>
+          <w:sz w:val="24"/>
+          <w:szCs w:val="24"/>
+        </w:rPr>
+        <w:t xml:space="preserve">, </w:t>
+      </w:r>
+      <w:proofErr w:type="spellStart"/>
+      <w:r>
+        <w:rPr>
+          <w:b/>
+          <w:bCs/>
+          <w:sz w:val="24"/>
+          <w:szCs w:val="24"/>
+        </w:rPr>
+        <w:t>item</w:t>
+      </w:r>
+      <w:r>
+        <w:rPr>
+          <w:b/>
+          <w:bCs/>
+          <w:sz w:val="24"/>
+          <w:szCs w:val="24"/>
+        </w:rPr>
+        <w:t>Title</w:t>
+      </w:r>
+      <w:proofErr w:type="spellEnd"/>
+      <w:r>
+        <w:rPr>
+          <w:b/>
+          <w:bCs/>
+          <w:sz w:val="24"/>
+          <w:szCs w:val="24"/>
+        </w:rPr>
+        <w:t xml:space="preserve">, </w:t>
+      </w:r>
+      <w:r>
+        <w:rPr>
+          <w:b/>
+          <w:bCs/>
+          <w:sz w:val="24"/>
+          <w:szCs w:val="24"/>
+        </w:rPr>
+        <w:t>value</w:t>
+      </w:r>
+    </w:p>
+    <w:p>
+      <w:pPr>
+        <w:pStyle w:val="a3"/>
+        <w:numPr>
+          <w:ilvl w:val="2"/>
+          <w:numId w:val="2"/>
+        </w:numPr>
+        <w:bidi w:val="0"/>
+        <w:rPr>
+          <w:b/>
+          <w:bCs/>
+          <w:sz w:val="24"/>
+          <w:szCs w:val="24"/>
+        </w:rPr>
+      </w:pPr>
+      <w:r>
+        <w:rPr>
+          <w:b/>
+          <w:bCs/>
+          <w:sz w:val="24"/>
+          <w:szCs w:val="24"/>
+        </w:rPr>
+        <w:t xml:space="preserve">Description: </w:t>
+      </w:r>
+      <w:r>
+        <w:rPr>
+          <w:b/>
+          <w:bCs/>
+          <w:sz w:val="24"/>
+          <w:szCs w:val="24"/>
+        </w:rPr>
+        <w:t>Save a user’s vote</w:t>
+      </w:r>
+      <w:r>
+        <w:rPr>
+          <w:b/>
+          <w:bCs/>
+          <w:sz w:val="24"/>
+          <w:szCs w:val="24"/>
+        </w:rPr>
+        <w:t xml:space="preserve"> to DB</w:t>
+      </w:r>
+    </w:p>
+    <w:p>
+      <w:pPr>
+        <w:pStyle w:val="a3"/>
+        <w:numPr>
+          <w:ilvl w:val="2"/>
+          <w:numId w:val="2"/>
+        </w:numPr>
+        <w:bidi w:val="0"/>
+        <w:rPr>
+          <w:b/>
+          <w:bCs/>
+          <w:color w:val="0070C0"/>
+          <w:sz w:val="24"/>
+          <w:szCs w:val="24"/>
+        </w:rPr>
+      </w:pPr>
+      <w:r>
+        <w:rPr>
+          <w:b/>
+          <w:bCs/>
+          <w:color w:val="0070C0"/>
+          <w:sz w:val="24"/>
+          <w:szCs w:val="24"/>
+        </w:rPr>
+        <w:t>GET</w:t>
+      </w:r>
+    </w:p>
+    <w:p>
+      <w:pPr>
+        <w:pStyle w:val="a3"/>
+        <w:numPr>
+          <w:ilvl w:val="2"/>
+          <w:numId w:val="2"/>
+        </w:numPr>
+        <w:bidi w:val="0"/>
+        <w:rPr>
+          <w:b/>
+          <w:bCs/>
+          <w:sz w:val="24"/>
+          <w:szCs w:val="24"/>
+        </w:rPr>
+      </w:pPr>
+      <w:r>
+        <w:rPr>
+          <w:b/>
+          <w:bCs/>
+          <w:sz w:val="24"/>
+          <w:szCs w:val="24"/>
+        </w:rPr>
+        <w:t xml:space="preserve">Description: Get </w:t>
+      </w:r>
+      <w:r>
+        <w:rPr>
+          <w:b/>
+          <w:bCs/>
+          <w:sz w:val="24"/>
+          <w:szCs w:val="24"/>
+        </w:rPr>
+        <w:t>all</w:t>
+      </w:r>
+      <w:r>
+        <w:rPr>
+          <w:b/>
+          <w:bCs/>
+          <w:sz w:val="24"/>
+          <w:szCs w:val="24"/>
+        </w:rPr>
+        <w:t xml:space="preserve"> logged-in user’s </w:t>
+      </w:r>
+      <w:r>
+        <w:rPr>
+          <w:b/>
+          <w:bCs/>
+          <w:sz w:val="24"/>
+          <w:szCs w:val="24"/>
+        </w:rPr>
+        <w:t>votes</w:t>
+      </w:r>
+    </w:p>
+    <w:p>
+      <w:pPr>
+        <w:pStyle w:val="a3"/>
+        <w:bidi w:val="0"/>
+        <w:ind w:left="1440"/>
+        <w:rPr>
+          <w:b/>
+          <w:bCs/>
+          <w:sz w:val="24"/>
+          <w:szCs w:val="24"/>
+        </w:rPr>
+      </w:pPr>
+    </w:p>
+    <w:p>
+      <w:pPr>
+        <w:pStyle w:val="a3"/>
         <w:bidi w:val="0"/>
         <w:ind w:left="2880"/>
         <w:rPr>
@@ -1239,15 +1720,7 @@
         <w:t xml:space="preserve">should </w:t>
       </w:r>
       <w:r>
-        <w:t xml:space="preserve">I </w:t>
-      </w:r>
-      <w:proofErr w:type="gramStart"/>
-      <w:r>
-        <w:t>implemented</w:t>
-      </w:r>
-      <w:proofErr w:type="gramEnd"/>
-      <w:r>
-        <w:t xml:space="preserve"> in my code:</w:t>
+        <w:t>I implement in my code:</w:t>
       </w:r>
     </w:p>
     <w:p>
@@ -1322,7 +1795,6 @@
           <w:sz w:val="24"/>
           <w:szCs w:val="24"/>
         </w:rPr>
-        <w:lastRenderedPageBreak/>
         <w:t>Repository pattern</w:t>
       </w:r>
     </w:p>
@@ -1449,6 +1921,31 @@
           <w:szCs w:val="24"/>
         </w:rPr>
         <w:t>Authentication, Authorization</w:t>
+      </w:r>
+    </w:p>
+    <w:p>
+      <w:pPr>
+        <w:pStyle w:val="a3"/>
+        <w:numPr>
+          <w:ilvl w:val="0"/>
+          <w:numId w:val="9"/>
+        </w:numPr>
+        <w:bidi w:val="0"/>
+        <w:rPr>
+          <w:b/>
+          <w:bCs/>
+          <w:sz w:val="24"/>
+          <w:szCs w:val="24"/>
+        </w:rPr>
+      </w:pPr>
+      <w:r>
+        <w:rPr>
+          <w:b/>
+          <w:bCs/>
+          <w:sz w:val="24"/>
+          <w:szCs w:val="24"/>
+        </w:rPr>
+        <w:t>Error handling middleware</w:t>
       </w:r>
     </w:p>
     <w:sectPr>

</xml_diff>

<commit_message>
Add user routes and error handling
</commit_message>
<xml_diff>
--- a/documents/AI Crypto Advisor Server Description.docx
+++ b/documents/AI Crypto Advisor Server Description.docx
@@ -140,16 +140,7 @@
           <w:sz w:val="24"/>
           <w:szCs w:val="24"/>
         </w:rPr>
-        <w:t>preference</w:t>
-      </w:r>
-      <w:r>
-        <w:rPr>
-          <w:b/>
-          <w:bCs/>
-          <w:sz w:val="24"/>
-          <w:szCs w:val="24"/>
-        </w:rPr>
-        <w:t>, votes</w:t>
+        <w:t>preference, votes</w:t>
       </w:r>
     </w:p>
     <w:p>
@@ -742,8 +733,28 @@
           <w:sz w:val="24"/>
           <w:szCs w:val="24"/>
         </w:rPr>
-        <w:t>/user</w:t>
-      </w:r>
+        <w:t>/</w:t>
+      </w:r>
+      <w:proofErr w:type="gramStart"/>
+      <w:r>
+        <w:rPr>
+          <w:b/>
+          <w:bCs/>
+          <w:sz w:val="24"/>
+          <w:szCs w:val="24"/>
+        </w:rPr>
+        <w:t>user</w:t>
+      </w:r>
+      <w:r>
+        <w:rPr>
+          <w:b/>
+          <w:bCs/>
+          <w:sz w:val="24"/>
+          <w:szCs w:val="24"/>
+        </w:rPr>
+        <w:t>s</w:t>
+      </w:r>
+      <w:proofErr w:type="gramEnd"/>
     </w:p>
     <w:p>
       <w:pPr>
@@ -899,16 +910,7 @@
           <w:sz w:val="24"/>
           <w:szCs w:val="24"/>
         </w:rPr>
-        <w:t>name</w:t>
-      </w:r>
-      <w:r>
-        <w:rPr>
-          <w:b/>
-          <w:bCs/>
-          <w:sz w:val="24"/>
-          <w:szCs w:val="24"/>
-        </w:rPr>
-        <w:t xml:space="preserve"> </w:t>
+        <w:t xml:space="preserve">name </w:t>
       </w:r>
       <w:r>
         <w:rPr>
@@ -3597,6 +3599,7 @@
   <w:style w:type="character" w:default="1" w:styleId="a0">
     <w:name w:val="Default Paragraph Font"/>
     <w:uiPriority w:val="1"/>
+    <w:semiHidden/>
     <w:unhideWhenUsed/>
   </w:style>
   <w:style w:type="table" w:default="1" w:styleId="a1">

</xml_diff>

<commit_message>
Update AI Crypto Advisor Server Description.docx
</commit_message>
<xml_diff>
--- a/documents/AI Crypto Advisor Server Description.docx
+++ b/documents/AI Crypto Advisor Server Description.docx
@@ -1162,6 +1162,69 @@
       <w:pPr>
         <w:pStyle w:val="a3"/>
         <w:numPr>
+          <w:ilvl w:val="0"/>
+          <w:numId w:val="2"/>
+        </w:numPr>
+        <w:bidi w:val="0"/>
+        <w:rPr>
+          <w:b/>
+          <w:bCs/>
+          <w:sz w:val="24"/>
+          <w:szCs w:val="24"/>
+        </w:rPr>
+      </w:pPr>
+      <w:r>
+        <w:rPr>
+          <w:b/>
+          <w:bCs/>
+          <w:sz w:val="24"/>
+          <w:szCs w:val="24"/>
+        </w:rPr>
+        <w:t>/</w:t>
+      </w:r>
+      <w:proofErr w:type="gramStart"/>
+      <w:r>
+        <w:rPr>
+          <w:b/>
+          <w:bCs/>
+          <w:sz w:val="24"/>
+          <w:szCs w:val="24"/>
+        </w:rPr>
+        <w:t>preferences</w:t>
+      </w:r>
+      <w:proofErr w:type="gramEnd"/>
+      <w:r>
+        <w:rPr>
+          <w:b/>
+          <w:bCs/>
+          <w:sz w:val="24"/>
+          <w:szCs w:val="24"/>
+        </w:rPr>
+        <w:t xml:space="preserve"> (</w:t>
+      </w:r>
+      <w:r>
+        <w:rPr>
+          <w:b/>
+          <w:bCs/>
+          <w:sz w:val="24"/>
+          <w:szCs w:val="24"/>
+        </w:rPr>
+        <w:t>Login first</w:t>
+      </w:r>
+      <w:r>
+        <w:rPr>
+          <w:b/>
+          <w:bCs/>
+          <w:sz w:val="24"/>
+          <w:szCs w:val="24"/>
+        </w:rPr>
+        <w:t>)</w:t>
+      </w:r>
+    </w:p>
+    <w:p>
+      <w:pPr>
+        <w:pStyle w:val="a3"/>
+        <w:numPr>
           <w:ilvl w:val="1"/>
           <w:numId w:val="2"/>
         </w:numPr>
@@ -1169,58 +1232,6 @@
         <w:rPr>
           <w:b/>
           <w:bCs/>
-          <w:sz w:val="24"/>
-          <w:szCs w:val="24"/>
-        </w:rPr>
-      </w:pPr>
-      <w:r>
-        <w:rPr>
-          <w:b/>
-          <w:bCs/>
-          <w:sz w:val="24"/>
-          <w:szCs w:val="24"/>
-        </w:rPr>
-        <w:t>/preferences</w:t>
-      </w:r>
-      <w:r>
-        <w:rPr>
-          <w:b/>
-          <w:bCs/>
-          <w:sz w:val="24"/>
-          <w:szCs w:val="24"/>
-        </w:rPr>
-        <w:t xml:space="preserve"> (</w:t>
-      </w:r>
-      <w:r>
-        <w:rPr>
-          <w:b/>
-          <w:bCs/>
-          <w:sz w:val="24"/>
-          <w:szCs w:val="24"/>
-        </w:rPr>
-        <w:t>Login first</w:t>
-      </w:r>
-      <w:r>
-        <w:rPr>
-          <w:b/>
-          <w:bCs/>
-          <w:sz w:val="24"/>
-          <w:szCs w:val="24"/>
-        </w:rPr>
-        <w:t>)</w:t>
-      </w:r>
-    </w:p>
-    <w:p>
-      <w:pPr>
-        <w:pStyle w:val="a3"/>
-        <w:numPr>
-          <w:ilvl w:val="2"/>
-          <w:numId w:val="2"/>
-        </w:numPr>
-        <w:bidi w:val="0"/>
-        <w:rPr>
-          <w:b/>
-          <w:bCs/>
           <w:color w:val="7030A0"/>
           <w:sz w:val="24"/>
           <w:szCs w:val="24"/>
@@ -1235,156 +1246,6 @@
           <w:szCs w:val="24"/>
         </w:rPr>
         <w:t>POST</w:t>
-      </w:r>
-    </w:p>
-    <w:p>
-      <w:pPr>
-        <w:pStyle w:val="a3"/>
-        <w:numPr>
-          <w:ilvl w:val="2"/>
-          <w:numId w:val="2"/>
-        </w:numPr>
-        <w:bidi w:val="0"/>
-        <w:rPr>
-          <w:b/>
-          <w:bCs/>
-          <w:sz w:val="24"/>
-          <w:szCs w:val="24"/>
-          <w:rtl/>
-        </w:rPr>
-      </w:pPr>
-      <w:r>
-        <w:rPr>
-          <w:b/>
-          <w:bCs/>
-          <w:sz w:val="24"/>
-          <w:szCs w:val="24"/>
-        </w:rPr>
-        <w:t>Body</w:t>
-      </w:r>
-      <w:r>
-        <w:rPr>
-          <w:b/>
-          <w:bCs/>
-          <w:sz w:val="24"/>
-          <w:szCs w:val="24"/>
-        </w:rPr>
-        <w:t>:</w:t>
-      </w:r>
-      <w:r>
-        <w:rPr>
-          <w:b/>
-          <w:bCs/>
-          <w:sz w:val="24"/>
-          <w:szCs w:val="24"/>
-        </w:rPr>
-        <w:t xml:space="preserve"> </w:t>
-      </w:r>
-      <w:r>
-        <w:rPr>
-          <w:b/>
-          <w:bCs/>
-          <w:sz w:val="24"/>
-          <w:szCs w:val="24"/>
-        </w:rPr>
-        <w:t xml:space="preserve">assets, </w:t>
-      </w:r>
-      <w:proofErr w:type="gramStart"/>
-      <w:r>
-        <w:rPr>
-          <w:b/>
-          <w:bCs/>
-          <w:sz w:val="24"/>
-          <w:szCs w:val="24"/>
-        </w:rPr>
-        <w:t>investorType ,</w:t>
-      </w:r>
-      <w:proofErr w:type="gramEnd"/>
-      <w:r>
-        <w:rPr>
-          <w:b/>
-          <w:bCs/>
-          <w:sz w:val="24"/>
-          <w:szCs w:val="24"/>
-        </w:rPr>
-        <w:t xml:space="preserve"> contentTypes</w:t>
-      </w:r>
-    </w:p>
-    <w:p>
-      <w:pPr>
-        <w:pStyle w:val="a3"/>
-        <w:numPr>
-          <w:ilvl w:val="2"/>
-          <w:numId w:val="2"/>
-        </w:numPr>
-        <w:bidi w:val="0"/>
-        <w:rPr>
-          <w:b/>
-          <w:bCs/>
-          <w:sz w:val="24"/>
-          <w:szCs w:val="24"/>
-        </w:rPr>
-      </w:pPr>
-      <w:r>
-        <w:rPr>
-          <w:b/>
-          <w:bCs/>
-          <w:sz w:val="24"/>
-          <w:szCs w:val="24"/>
-        </w:rPr>
-        <w:t>Description: Save user onboarding preferences to DB</w:t>
-      </w:r>
-    </w:p>
-    <w:p>
-      <w:pPr>
-        <w:pStyle w:val="a3"/>
-        <w:numPr>
-          <w:ilvl w:val="2"/>
-          <w:numId w:val="2"/>
-        </w:numPr>
-        <w:bidi w:val="0"/>
-        <w:rPr>
-          <w:b/>
-          <w:bCs/>
-          <w:color w:val="0070C0"/>
-          <w:sz w:val="24"/>
-          <w:szCs w:val="24"/>
-        </w:rPr>
-      </w:pPr>
-      <w:r>
-        <w:rPr>
-          <w:b/>
-          <w:bCs/>
-          <w:color w:val="0070C0"/>
-          <w:sz w:val="24"/>
-          <w:szCs w:val="24"/>
-        </w:rPr>
-        <w:t>GET</w:t>
-      </w:r>
-    </w:p>
-    <w:p>
-      <w:pPr>
-        <w:pStyle w:val="a3"/>
-        <w:numPr>
-          <w:ilvl w:val="2"/>
-          <w:numId w:val="2"/>
-        </w:numPr>
-        <w:bidi w:val="0"/>
-        <w:rPr>
-          <w:b/>
-          <w:bCs/>
-          <w:sz w:val="24"/>
-          <w:szCs w:val="24"/>
-        </w:rPr>
-      </w:pPr>
-      <w:r>
-        <w:rPr>
-          <w:b/>
-          <w:bCs/>
-          <w:sz w:val="24"/>
-          <w:szCs w:val="24"/>
-        </w:rPr>
-        <w:t>Description: Get the logged-in user’s preferences</w:t>
       </w:r>
     </w:p>
     <w:p>
@@ -1400,6 +1261,156 @@
           <w:bCs/>
           <w:sz w:val="24"/>
           <w:szCs w:val="24"/>
+          <w:rtl/>
+        </w:rPr>
+      </w:pPr>
+      <w:r>
+        <w:rPr>
+          <w:b/>
+          <w:bCs/>
+          <w:sz w:val="24"/>
+          <w:szCs w:val="24"/>
+        </w:rPr>
+        <w:t>Body</w:t>
+      </w:r>
+      <w:r>
+        <w:rPr>
+          <w:b/>
+          <w:bCs/>
+          <w:sz w:val="24"/>
+          <w:szCs w:val="24"/>
+        </w:rPr>
+        <w:t>:</w:t>
+      </w:r>
+      <w:r>
+        <w:rPr>
+          <w:b/>
+          <w:bCs/>
+          <w:sz w:val="24"/>
+          <w:szCs w:val="24"/>
+        </w:rPr>
+        <w:t xml:space="preserve"> </w:t>
+      </w:r>
+      <w:r>
+        <w:rPr>
+          <w:b/>
+          <w:bCs/>
+          <w:sz w:val="24"/>
+          <w:szCs w:val="24"/>
+        </w:rPr>
+        <w:t xml:space="preserve">assets, </w:t>
+      </w:r>
+      <w:proofErr w:type="gramStart"/>
+      <w:r>
+        <w:rPr>
+          <w:b/>
+          <w:bCs/>
+          <w:sz w:val="24"/>
+          <w:szCs w:val="24"/>
+        </w:rPr>
+        <w:t>investorType ,</w:t>
+      </w:r>
+      <w:proofErr w:type="gramEnd"/>
+      <w:r>
+        <w:rPr>
+          <w:b/>
+          <w:bCs/>
+          <w:sz w:val="24"/>
+          <w:szCs w:val="24"/>
+        </w:rPr>
+        <w:t xml:space="preserve"> contentTypes</w:t>
+      </w:r>
+    </w:p>
+    <w:p>
+      <w:pPr>
+        <w:pStyle w:val="a3"/>
+        <w:numPr>
+          <w:ilvl w:val="1"/>
+          <w:numId w:val="2"/>
+        </w:numPr>
+        <w:bidi w:val="0"/>
+        <w:rPr>
+          <w:b/>
+          <w:bCs/>
+          <w:sz w:val="24"/>
+          <w:szCs w:val="24"/>
+        </w:rPr>
+      </w:pPr>
+      <w:r>
+        <w:rPr>
+          <w:b/>
+          <w:bCs/>
+          <w:sz w:val="24"/>
+          <w:szCs w:val="24"/>
+        </w:rPr>
+        <w:t>Description: Save user onboarding preferences to DB</w:t>
+      </w:r>
+    </w:p>
+    <w:p>
+      <w:pPr>
+        <w:pStyle w:val="a3"/>
+        <w:numPr>
+          <w:ilvl w:val="1"/>
+          <w:numId w:val="2"/>
+        </w:numPr>
+        <w:bidi w:val="0"/>
+        <w:rPr>
+          <w:b/>
+          <w:bCs/>
+          <w:color w:val="0070C0"/>
+          <w:sz w:val="24"/>
+          <w:szCs w:val="24"/>
+        </w:rPr>
+      </w:pPr>
+      <w:r>
+        <w:rPr>
+          <w:b/>
+          <w:bCs/>
+          <w:color w:val="0070C0"/>
+          <w:sz w:val="24"/>
+          <w:szCs w:val="24"/>
+        </w:rPr>
+        <w:t>GET</w:t>
+      </w:r>
+    </w:p>
+    <w:p>
+      <w:pPr>
+        <w:pStyle w:val="a3"/>
+        <w:numPr>
+          <w:ilvl w:val="1"/>
+          <w:numId w:val="2"/>
+        </w:numPr>
+        <w:bidi w:val="0"/>
+        <w:rPr>
+          <w:b/>
+          <w:bCs/>
+          <w:sz w:val="24"/>
+          <w:szCs w:val="24"/>
+        </w:rPr>
+      </w:pPr>
+      <w:r>
+        <w:rPr>
+          <w:b/>
+          <w:bCs/>
+          <w:sz w:val="24"/>
+          <w:szCs w:val="24"/>
+        </w:rPr>
+        <w:t>Description: Get the logged-in user’s preferences</w:t>
+      </w:r>
+    </w:p>
+    <w:p>
+      <w:pPr>
+        <w:pStyle w:val="a3"/>
+        <w:numPr>
+          <w:ilvl w:val="0"/>
+          <w:numId w:val="2"/>
+        </w:numPr>
+        <w:bidi w:val="0"/>
+        <w:rPr>
+          <w:b/>
+          <w:bCs/>
+          <w:sz w:val="24"/>
+          <w:szCs w:val="24"/>
         </w:rPr>
       </w:pPr>
       <w:r>
@@ -1455,7 +1466,7 @@
       <w:pPr>
         <w:pStyle w:val="a3"/>
         <w:numPr>
-          <w:ilvl w:val="2"/>
+          <w:ilvl w:val="1"/>
           <w:numId w:val="2"/>
         </w:numPr>
         <w:bidi w:val="0"/>
@@ -1482,7 +1493,7 @@
       <w:pPr>
         <w:pStyle w:val="a3"/>
         <w:numPr>
-          <w:ilvl w:val="2"/>
+          <w:ilvl w:val="1"/>
           <w:numId w:val="2"/>
         </w:numPr>
         <w:bidi w:val="0"/>
@@ -1566,7 +1577,7 @@
       <w:pPr>
         <w:pStyle w:val="a3"/>
         <w:numPr>
-          <w:ilvl w:val="2"/>
+          <w:ilvl w:val="1"/>
           <w:numId w:val="2"/>
         </w:numPr>
         <w:bidi w:val="0"/>
@@ -1609,7 +1620,7 @@
       <w:pPr>
         <w:pStyle w:val="a3"/>
         <w:numPr>
-          <w:ilvl w:val="2"/>
+          <w:ilvl w:val="1"/>
           <w:numId w:val="2"/>
         </w:numPr>
         <w:bidi w:val="0"/>
@@ -1636,7 +1647,7 @@
       <w:pPr>
         <w:pStyle w:val="a3"/>
         <w:numPr>
-          <w:ilvl w:val="2"/>
+          <w:ilvl w:val="1"/>
           <w:numId w:val="2"/>
         </w:numPr>
         <w:bidi w:val="0"/>

</xml_diff>